<commit_message>
update modul 11 & 12 v2
</commit_message>
<xml_diff>
--- a/assets/file/materi/Modul Pertemuan 11 - Helper Form dan Database.docx
+++ b/assets/file/materi/Modul Pertemuan 11 - Helper Form dan Database.docx
@@ -4328,6 +4328,8 @@
       <w:r>
         <w:rPr>
           <w:rFonts w:asciiTheme="majorHAnsi" w:hAnsiTheme="majorHAnsi" w:cstheme="majorHAnsi"/>
+          <w:noProof/>
+          <w:lang w:val="en-US" w:eastAsia="en-US"/>
         </w:rPr>
         <w:drawing>
           <wp:inline distT="0" distB="0" distL="0" distR="0" wp14:anchorId="411D1CAF" wp14:editId="14E24FC0">
@@ -4440,6 +4442,8 @@
       <w:r>
         <w:rPr>
           <w:rFonts w:asciiTheme="majorHAnsi" w:hAnsiTheme="majorHAnsi" w:cstheme="majorHAnsi"/>
+          <w:noProof/>
+          <w:lang w:val="en-US" w:eastAsia="en-US"/>
         </w:rPr>
         <w:drawing>
           <wp:inline distT="0" distB="0" distL="0" distR="0" wp14:anchorId="19EBB613" wp14:editId="6ADBDBAC">
@@ -5498,6 +5502,8 @@
       <w:r>
         <w:rPr>
           <w:rFonts w:asciiTheme="majorHAnsi" w:hAnsiTheme="majorHAnsi" w:cstheme="majorHAnsi"/>
+          <w:noProof/>
+          <w:lang w:val="en-US" w:eastAsia="en-US"/>
         </w:rPr>
         <w:drawing>
           <wp:inline distT="0" distB="0" distL="0" distR="0" wp14:anchorId="0904F3CC" wp14:editId="71B90D43">
@@ -6612,6 +6618,8 @@
       <w:r>
         <w:rPr>
           <w:rFonts w:asciiTheme="majorHAnsi" w:hAnsiTheme="majorHAnsi" w:cstheme="majorHAnsi"/>
+          <w:noProof/>
+          <w:lang w:val="en-US" w:eastAsia="en-US"/>
         </w:rPr>
         <w:drawing>
           <wp:inline distT="0" distB="0" distL="0" distR="0" wp14:anchorId="486B54F2" wp14:editId="58A69337">
@@ -7341,6 +7349,36 @@
     <w:p>
       <w:pPr>
         <w:pStyle w:val="ListParagraph"/>
+        <w:numPr>
+          <w:ilvl w:val="0"/>
+          <w:numId w:val="14"/>
+        </w:numPr>
+        <w:jc w:val="both"/>
+        <w:rPr>
+          <w:rFonts w:asciiTheme="majorHAnsi" w:hAnsiTheme="majorHAnsi" w:cstheme="majorHAnsi"/>
+        </w:rPr>
+      </w:pPr>
+      <w:r>
+        <w:rPr>
+          <w:rFonts w:asciiTheme="majorHAnsi" w:hAnsiTheme="majorHAnsi" w:cstheme="majorHAnsi"/>
+        </w:rPr>
+        <w:t xml:space="preserve">File jadi </w:t>
+      </w:r>
+      <w:hyperlink r:id="rId55" w:history="1">
+        <w:r>
+          <w:rPr>
+            <w:rStyle w:val="Hyperlink"/>
+            <w:rFonts w:asciiTheme="majorHAnsi" w:hAnsiTheme="majorHAnsi" w:cstheme="majorHAnsi"/>
+          </w:rPr>
+          <w:t>ci_project_11</w:t>
+        </w:r>
+      </w:hyperlink>
+      <w:bookmarkStart w:id="0" w:name="_GoBack"/>
+      <w:bookmarkEnd w:id="0"/>
+    </w:p>
+    <w:p>
+      <w:pPr>
+        <w:pStyle w:val="ListParagraph"/>
         <w:rPr>
           <w:rFonts w:asciiTheme="majorHAnsi" w:hAnsiTheme="majorHAnsi" w:cstheme="majorHAnsi"/>
         </w:rPr>
@@ -7357,8 +7395,6 @@
           <w:szCs w:val="32"/>
         </w:rPr>
       </w:pPr>
-      <w:bookmarkStart w:id="0" w:name="_GoBack"/>
-      <w:bookmarkEnd w:id="0"/>
       <w:r>
         <w:rPr>
           <w:rFonts w:ascii="Calibri" w:eastAsia="Calibri" w:hAnsi="Calibri" w:cs="Calibri"/>
@@ -7367,7 +7403,6 @@
           <w:sz w:val="32"/>
           <w:szCs w:val="32"/>
         </w:rPr>
-        <w:lastRenderedPageBreak/>
         <w:t>RANGKUMAN</w:t>
       </w:r>
     </w:p>
@@ -7478,10 +7513,10 @@
       </w:pPr>
     </w:p>
     <w:sectPr>
-      <w:headerReference w:type="default" r:id="rId55"/>
-      <w:footerReference w:type="default" r:id="rId56"/>
-      <w:headerReference w:type="first" r:id="rId57"/>
-      <w:footerReference w:type="first" r:id="rId58"/>
+      <w:headerReference w:type="default" r:id="rId56"/>
+      <w:footerReference w:type="default" r:id="rId57"/>
+      <w:headerReference w:type="first" r:id="rId58"/>
+      <w:footerReference w:type="first" r:id="rId59"/>
       <w:pgSz w:w="11907" w:h="16840"/>
       <w:pgMar w:top="1418" w:right="1842" w:bottom="1276" w:left="1418" w:header="720" w:footer="720" w:gutter="0"/>
       <w:pgNumType w:start="1"/>
@@ -7557,7 +7592,7 @@
         <w:noProof/>
         <w:color w:val="FFFFFF"/>
       </w:rPr>
-      <w:t>19</w:t>
+      <w:t>18</w:t>
     </w:r>
     <w:r>
       <w:rPr>
@@ -8647,7 +8682,7 @@
                       <wps:cNvPr id="3" name="Parallelogram 12">
                         <a:extLst>
                           <a:ext uri="{FF2B5EF4-FFF2-40B4-BE49-F238E27FC236}">
-                            <a16:creationId xmlns:a16="http://schemas.microsoft.com/office/drawing/2014/main" xmlns:w16se="http://schemas.microsoft.com/office/word/2015/wordml/symex" xmlns:w16="http://schemas.microsoft.com/office/word/2018/wordml" xmlns:w16cid="http://schemas.microsoft.com/office/word/2016/wordml/cid" xmlns:w16cex="http://schemas.microsoft.com/office/word/2018/wordml/cex" xmlns:w="http://schemas.openxmlformats.org/wordprocessingml/2006/main" xmlns:w10="urn:schemas-microsoft-com:office:word" xmlns:v="urn:schemas-microsoft-com:vml" xmlns:o="urn:schemas-microsoft-com:office:office" xmlns:am3d="http://schemas.microsoft.com/office/drawing/2017/model3d" xmlns:aink="http://schemas.microsoft.com/office/drawing/2016/ink" xmlns:cx8="http://schemas.microsoft.com/office/drawing/2016/5/14/chartex" xmlns:cx7="http://schemas.microsoft.com/office/drawing/2016/5/13/chartex" xmlns:cx6="http://schemas.microsoft.com/office/drawing/2016/5/12/chartex" xmlns:cx5="http://schemas.microsoft.com/office/drawing/2016/5/11/chartex" xmlns:cx4="http://schemas.microsoft.com/office/drawing/2016/5/10/chartex" xmlns:cx3="http://schemas.microsoft.com/office/drawing/2016/5/9/chartex" xmlns:cx2="http://schemas.microsoft.com/office/drawing/2015/10/21/chartex" xmlns:cx1="http://schemas.microsoft.com/office/drawing/2015/9/8/chartex" xmlns:cx="http://schemas.microsoft.com/office/drawing/2014/chartex" xmlns="" xmlns:w15="http://schemas.microsoft.com/office/word/2012/wordml" id="{0DF4DB2E-1B08-B444-B2FC-E7FB68181731}"/>
+                            <a16:creationId xmlns:w15="http://schemas.microsoft.com/office/word/2012/wordml" xmlns="" xmlns:cx="http://schemas.microsoft.com/office/drawing/2014/chartex" xmlns:cx1="http://schemas.microsoft.com/office/drawing/2015/9/8/chartex" xmlns:cx2="http://schemas.microsoft.com/office/drawing/2015/10/21/chartex" xmlns:cx3="http://schemas.microsoft.com/office/drawing/2016/5/9/chartex" xmlns:cx4="http://schemas.microsoft.com/office/drawing/2016/5/10/chartex" xmlns:cx5="http://schemas.microsoft.com/office/drawing/2016/5/11/chartex" xmlns:cx6="http://schemas.microsoft.com/office/drawing/2016/5/12/chartex" xmlns:cx7="http://schemas.microsoft.com/office/drawing/2016/5/13/chartex" xmlns:cx8="http://schemas.microsoft.com/office/drawing/2016/5/14/chartex" xmlns:aink="http://schemas.microsoft.com/office/drawing/2016/ink" xmlns:am3d="http://schemas.microsoft.com/office/drawing/2017/model3d" xmlns:o="urn:schemas-microsoft-com:office:office" xmlns:v="urn:schemas-microsoft-com:vml" xmlns:w10="urn:schemas-microsoft-com:office:word" xmlns:w="http://schemas.openxmlformats.org/wordprocessingml/2006/main" xmlns:w16cex="http://schemas.microsoft.com/office/word/2018/wordml/cex" xmlns:w16cid="http://schemas.microsoft.com/office/word/2016/wordml/cid" xmlns:w16="http://schemas.microsoft.com/office/word/2018/wordml" xmlns:w16se="http://schemas.microsoft.com/office/word/2015/wordml/symex" xmlns:a16="http://schemas.microsoft.com/office/drawing/2014/main" id="{0DF4DB2E-1B08-B444-B2FC-E7FB68181731}"/>
                           </a:ext>
                         </a:extLst>
                       </wps:cNvPr>
@@ -9731,7 +9766,7 @@
               <wp:docPr id="9" name="Freeform 19">
                 <a:extLst xmlns:a="http://schemas.openxmlformats.org/drawingml/2006/main">
                   <a:ext uri="{FF2B5EF4-FFF2-40B4-BE49-F238E27FC236}">
-                    <a16:creationId xmlns:a16="http://schemas.microsoft.com/office/drawing/2014/main" xmlns:w16se="http://schemas.microsoft.com/office/word/2015/wordml/symex" xmlns:w16="http://schemas.microsoft.com/office/word/2018/wordml" xmlns:w16cid="http://schemas.microsoft.com/office/word/2016/wordml/cid" xmlns:w16cex="http://schemas.microsoft.com/office/word/2018/wordml/cex" xmlns:w="http://schemas.openxmlformats.org/wordprocessingml/2006/main" xmlns:w10="urn:schemas-microsoft-com:office:word" xmlns:v="urn:schemas-microsoft-com:vml" xmlns:o="urn:schemas-microsoft-com:office:office" xmlns:am3d="http://schemas.microsoft.com/office/drawing/2017/model3d" xmlns:aink="http://schemas.microsoft.com/office/drawing/2016/ink" xmlns:cx8="http://schemas.microsoft.com/office/drawing/2016/5/14/chartex" xmlns:cx7="http://schemas.microsoft.com/office/drawing/2016/5/13/chartex" xmlns:cx6="http://schemas.microsoft.com/office/drawing/2016/5/12/chartex" xmlns:cx5="http://schemas.microsoft.com/office/drawing/2016/5/11/chartex" xmlns:cx4="http://schemas.microsoft.com/office/drawing/2016/5/10/chartex" xmlns:cx3="http://schemas.microsoft.com/office/drawing/2016/5/9/chartex" xmlns:cx2="http://schemas.microsoft.com/office/drawing/2015/10/21/chartex" xmlns:cx1="http://schemas.microsoft.com/office/drawing/2015/9/8/chartex" xmlns:cx="http://schemas.microsoft.com/office/drawing/2014/chartex" xmlns="" xmlns:w15="http://schemas.microsoft.com/office/word/2012/wordml" id="{7E1B7167-0843-9649-8C5E-3D07F055F899}"/>
+                    <a16:creationId xmlns:w15="http://schemas.microsoft.com/office/word/2012/wordml" xmlns="" xmlns:cx="http://schemas.microsoft.com/office/drawing/2014/chartex" xmlns:cx1="http://schemas.microsoft.com/office/drawing/2015/9/8/chartex" xmlns:cx2="http://schemas.microsoft.com/office/drawing/2015/10/21/chartex" xmlns:cx3="http://schemas.microsoft.com/office/drawing/2016/5/9/chartex" xmlns:cx4="http://schemas.microsoft.com/office/drawing/2016/5/10/chartex" xmlns:cx5="http://schemas.microsoft.com/office/drawing/2016/5/11/chartex" xmlns:cx6="http://schemas.microsoft.com/office/drawing/2016/5/12/chartex" xmlns:cx7="http://schemas.microsoft.com/office/drawing/2016/5/13/chartex" xmlns:cx8="http://schemas.microsoft.com/office/drawing/2016/5/14/chartex" xmlns:aink="http://schemas.microsoft.com/office/drawing/2016/ink" xmlns:am3d="http://schemas.microsoft.com/office/drawing/2017/model3d" xmlns:o="urn:schemas-microsoft-com:office:office" xmlns:v="urn:schemas-microsoft-com:vml" xmlns:w10="urn:schemas-microsoft-com:office:word" xmlns:w="http://schemas.openxmlformats.org/wordprocessingml/2006/main" xmlns:w16cex="http://schemas.microsoft.com/office/word/2018/wordml/cex" xmlns:w16cid="http://schemas.microsoft.com/office/word/2016/wordml/cid" xmlns:w16="http://schemas.microsoft.com/office/word/2018/wordml" xmlns:w16se="http://schemas.microsoft.com/office/word/2015/wordml/symex" xmlns:a16="http://schemas.microsoft.com/office/drawing/2014/main" id="{7E1B7167-0843-9649-8C5E-3D07F055F899}"/>
                   </a:ext>
                 </a:extLst>
               </wp:docPr>
@@ -13332,7 +13367,7 @@
 </file>
 
 <file path=customXml/itemProps1.xml><?xml version="1.0" encoding="utf-8"?>
-<ds:datastoreItem xmlns:ds="http://schemas.openxmlformats.org/officeDocument/2006/customXml" ds:itemID="{20685F0A-3EAE-44C4-A664-23950DF10880}">
+<ds:datastoreItem xmlns:ds="http://schemas.openxmlformats.org/officeDocument/2006/customXml" ds:itemID="{03915EDA-7E58-4D7E-A495-2B6913155B0D}">
   <ds:schemaRefs>
     <ds:schemaRef ds:uri="http://schemas.openxmlformats.org/officeDocument/2006/bibliography"/>
   </ds:schemaRefs>

</xml_diff>